<commit_message>
upload current generated files
</commit_message>
<xml_diff>
--- a/Versions-html-and-docx/section_bois_v4.docx
+++ b/Versions-html-and-docx/section_bois_v4.docx
@@ -95,7 +95,7 @@
         <w:t xml:space="preserve">Découverte clé : </w:t>
       </w:r>
       <w:r>
-        <w:t>le cor anglais (F1=452 Hz) et le basson (F1=502 Hz) tombent dans le cluster de convergence 450–502 Hz, aux côtés du cor, du trombone et du violoncelle. Le basson présente une convergence Δ=3 Hz avec le violoncelle — la doublure formantiquement la plus parfaite du corpus.</w:t>
+        <w:t>le cor anglais (F1=452 Hz) et le basson (F1=495 Hz) sont dans la zone /o/. Convergences clés : cor anglais + clarinette Sib Δ=11 Hz (452 vs 463 Hz), basson + violon Δ=11 Hz (495 vs 506 Hz), cor anglais + cor Δ=64 Hz (452 vs 388 Hz).</w:t>
       </w:r>
     </w:p>
     <w:p>
@@ -176,7 +176,7 @@
           <w:i/>
           <w:sz w:val="20"/>
         </w:rPr>
-        <w:t>Instrument le plus aigu spectralement de l'orchestre. Comme la grande flûte, il ne possède pas de formant fixe au sens strict — son énergie spectrale est concentrée dans les hautes fréquences (F1=2 336 Hz, zone frontière /e/–/i/). Backus cite ~3 400 Hz, confirmant la tendance spectrale aiguë. Variation dynamique : pp=1 963 Hz, mf=2 469 Hz, ff=2 417 Hz.</w:t>
+        <w:t>Instrument le plus aigu spectralement de l'orchestre. Comme la grande flûte, il ne possède pas de formant fixe au sens strict — son énergie spectrale est concentrée dans les hautes fréquences (F1=1 109 Hz, zone /e/). Backus cite ~3 400 Hz correspondant au Fp ou au sommet de la courbe de rayonnement. Fp non calculé dans le corpus actuel. La variation dynamique est marquée : la piccolo projette dans les aigu extrêmes en forte.</w:t>
       </w:r>
     </w:p>
     <w:p>
@@ -1335,7 +1335,7 @@
                 <w:b w:val="0"/>
                 <w:sz w:val="18"/>
               </w:rPr>
-              <w:t>2 336</w:t>
+              <w:t>1 109</w:t>
             </w:r>
           </w:p>
         </w:tc>
@@ -1353,7 +1353,7 @@
                 <w:b w:val="0"/>
                 <w:sz w:val="18"/>
               </w:rPr>
-              <w:t>1 354</w:t>
+              <w:t>743</w:t>
             </w:r>
           </w:p>
         </w:tc>
@@ -1371,7 +1371,7 @@
                 <w:b w:val="0"/>
                 <w:sz w:val="18"/>
               </w:rPr>
-              <w:t>982</w:t>
+              <w:t>Δ=366 Hz</w:t>
             </w:r>
           </w:p>
         </w:tc>
@@ -1445,7 +1445,7 @@
                 <w:b w:val="0"/>
                 <w:sz w:val="18"/>
               </w:rPr>
-              <w:t>2 336</w:t>
+              <w:t>1 109</w:t>
             </w:r>
           </w:p>
         </w:tc>
@@ -1463,7 +1463,7 @@
                 <w:b w:val="0"/>
                 <w:sz w:val="18"/>
               </w:rPr>
-              <w:t>1 034</w:t>
+              <w:t>506</w:t>
             </w:r>
           </w:p>
         </w:tc>
@@ -1481,7 +1481,7 @@
                 <w:b w:val="0"/>
                 <w:sz w:val="18"/>
               </w:rPr>
-              <w:t>1 302</w:t>
+              <w:t>Δ=603 Hz</w:t>
             </w:r>
           </w:p>
         </w:tc>
@@ -1581,7 +1581,7 @@
           <w:i/>
           <w:sz w:val="20"/>
         </w:rPr>
-        <w:t>La flûte ne possède pas de formant fixe (Meyer, Giesler) : son spectre varie fortement avec le registre et le souffle. Les valeurs représentent des zones spectrales moyennes. Écart entre sources : Backus (~1 700 Hz) vs SOL2020 (1 354 Hz), Δ=346 Hz. Le Fp centroïde à 1 535 Hz est plus stable que F1 (σ F1=480 Hz vs σ Fp≈150 Hz). La flûte est l'instrument harmoniquement le plus plastique de l'orchestre.</w:t>
+        <w:t>La flûte ne possède pas de formant fixe (Meyer, Giesler) : son spectre varie fortement avec le registre et le souffle. F1 spectral strict = 743 Hz (zone /å/). Écart entre sources : Backus (~1 700 Hz) vs SOL2020 (743 Hz strict, Fp=1 535 Hz). Le Fp centroïde à 1 535 Hz est plus stable que F1 (σ F1=480 Hz vs σ Fp≈150 Hz). La flûte est l'instrument harmoniquement le plus plastique de l'orchestre.</w:t>
       </w:r>
     </w:p>
     <w:p>
@@ -7015,7 +7015,7 @@
                 <w:b/>
                 <w:sz w:val="18"/>
               </w:rPr>
-              <w:t>Violon</w:t>
+              <w:t>Hautbois</w:t>
             </w:r>
           </w:p>
         </w:tc>
@@ -7033,7 +7033,7 @@
                 <w:b w:val="0"/>
                 <w:sz w:val="18"/>
               </w:rPr>
-              <w:t>1 354</w:t>
+              <w:t>743</w:t>
             </w:r>
           </w:p>
         </w:tc>
@@ -7051,7 +7051,7 @@
                 <w:b w:val="0"/>
                 <w:sz w:val="18"/>
               </w:rPr>
-              <w:t>1 034</w:t>
+              <w:t>743</w:t>
             </w:r>
           </w:p>
         </w:tc>
@@ -7069,7 +7069,7 @@
                 <w:b w:val="0"/>
                 <w:sz w:val="18"/>
               </w:rPr>
-              <w:t>Δ=320 Hz</w:t>
+              <w:t>Δ=0 Hz</w:t>
             </w:r>
           </w:p>
         </w:tc>
@@ -7087,7 +7087,7 @@
                 <w:b w:val="0"/>
                 <w:sz w:val="18"/>
               </w:rPr>
-              <w:t>Bonne</w:t>
+              <w:t>Quasi-parfaite ★</w:t>
             </w:r>
           </w:p>
         </w:tc>
@@ -7125,7 +7125,7 @@
                 <w:b/>
                 <w:sz w:val="18"/>
               </w:rPr>
-              <w:t>Hautbois</w:t>
+              <w:t>Violon</w:t>
             </w:r>
           </w:p>
         </w:tc>
@@ -7143,7 +7143,7 @@
                 <w:b w:val="0"/>
                 <w:sz w:val="18"/>
               </w:rPr>
-              <w:t>1 354</w:t>
+              <w:t>743</w:t>
             </w:r>
           </w:p>
         </w:tc>
@@ -7161,7 +7161,7 @@
                 <w:b w:val="0"/>
                 <w:sz w:val="18"/>
               </w:rPr>
-              <w:t>1 460</w:t>
+              <w:t>506</w:t>
             </w:r>
           </w:p>
         </w:tc>
@@ -7179,7 +7179,7 @@
                 <w:b w:val="0"/>
                 <w:sz w:val="18"/>
               </w:rPr>
-              <w:t>Δ=106 Hz</w:t>
+              <w:t>Δ=237 Hz</w:t>
             </w:r>
           </w:p>
         </w:tc>
@@ -7197,7 +7197,7 @@
                 <w:b w:val="0"/>
                 <w:sz w:val="18"/>
               </w:rPr>
-              <w:t>Bonne</w:t>
+              <w:t>Complémentaire</w:t>
             </w:r>
           </w:p>
         </w:tc>
@@ -7253,7 +7253,7 @@
                 <w:b w:val="0"/>
                 <w:sz w:val="18"/>
               </w:rPr>
-              <w:t>1 354</w:t>
+              <w:t>743</w:t>
             </w:r>
           </w:p>
         </w:tc>
@@ -7271,7 +7271,7 @@
                 <w:b w:val="0"/>
                 <w:sz w:val="18"/>
               </w:rPr>
-              <w:t>1 016</w:t>
+              <w:t>463</w:t>
             </w:r>
           </w:p>
         </w:tc>
@@ -7289,7 +7289,7 @@
                 <w:b w:val="0"/>
                 <w:sz w:val="18"/>
               </w:rPr>
-              <w:t>Δ=338 Hz</w:t>
+              <w:t>Δ=280 Hz</w:t>
             </w:r>
           </w:p>
         </w:tc>
@@ -9993,7 +9993,7 @@
                 <w:b w:val="0"/>
                 <w:sz w:val="18"/>
               </w:rPr>
-              <w:t>200</w:t>
+              <w:t>172</w:t>
             </w:r>
           </w:p>
         </w:tc>
@@ -10011,7 +10011,7 @@
                 <w:b w:val="0"/>
                 <w:sz w:val="18"/>
               </w:rPr>
-              <w:t>Δ=134 Hz</w:t>
+              <w:t>Δ=162 Hz</w:t>
             </w:r>
           </w:p>
         </w:tc>
@@ -10103,7 +10103,7 @@
                 <w:b w:val="0"/>
                 <w:sz w:val="18"/>
               </w:rPr>
-              <w:t>249</w:t>
+              <w:t>226</w:t>
             </w:r>
           </w:p>
         </w:tc>
@@ -10121,7 +10121,7 @@
                 <w:b w:val="0"/>
                 <w:sz w:val="18"/>
               </w:rPr>
-              <w:t>Δ=85 Hz</w:t>
+              <w:t>Δ=108 Hz</w:t>
             </w:r>
           </w:p>
         </w:tc>
@@ -14614,7 +14614,7 @@
                 <w:b/>
                 <w:sz w:val="18"/>
               </w:rPr>
-              <w:t>Cor anglais</w:t>
+              <w:t>Flûte</w:t>
             </w:r>
           </w:p>
         </w:tc>
@@ -14650,7 +14650,7 @@
                 <w:b w:val="0"/>
                 <w:sz w:val="18"/>
               </w:rPr>
-              <w:t>452</w:t>
+              <w:t>743</w:t>
             </w:r>
           </w:p>
         </w:tc>
@@ -14668,7 +14668,7 @@
                 <w:b w:val="0"/>
                 <w:sz w:val="18"/>
               </w:rPr>
-              <w:t>Δ=291 Hz</w:t>
+              <w:t>Δ=0 Hz</w:t>
             </w:r>
           </w:p>
         </w:tc>
@@ -14686,7 +14686,7 @@
                 <w:b w:val="0"/>
                 <w:sz w:val="18"/>
               </w:rPr>
-              <w:t>Complémentaire</w:t>
+              <w:t>Quasi-parfaite ★</w:t>
             </w:r>
           </w:p>
         </w:tc>
@@ -14724,6 +14724,116 @@
                 <w:b/>
                 <w:sz w:val="18"/>
               </w:rPr>
+              <w:t>Cor anglais</w:t>
+            </w:r>
+          </w:p>
+        </w:tc>
+        <w:tc>
+          <w:tcPr>
+            <w:tcW w:type="dxa" w:w="907"/>
+          </w:tcPr>
+          <w:p>
+            <w:pPr>
+              <w:jc w:val="center"/>
+            </w:pPr>
+            <w:r/>
+            <w:r>
+              <w:rPr>
+                <w:b w:val="0"/>
+                <w:sz w:val="18"/>
+              </w:rPr>
+              <w:t>743</w:t>
+            </w:r>
+          </w:p>
+        </w:tc>
+        <w:tc>
+          <w:tcPr>
+            <w:tcW w:type="dxa" w:w="907"/>
+          </w:tcPr>
+          <w:p>
+            <w:pPr>
+              <w:jc w:val="center"/>
+            </w:pPr>
+            <w:r/>
+            <w:r>
+              <w:rPr>
+                <w:b w:val="0"/>
+                <w:sz w:val="18"/>
+              </w:rPr>
+              <w:t>452</w:t>
+            </w:r>
+          </w:p>
+        </w:tc>
+        <w:tc>
+          <w:tcPr>
+            <w:tcW w:type="dxa" w:w="1020"/>
+          </w:tcPr>
+          <w:p>
+            <w:pPr>
+              <w:jc w:val="center"/>
+            </w:pPr>
+            <w:r/>
+            <w:r>
+              <w:rPr>
+                <w:b w:val="0"/>
+                <w:sz w:val="18"/>
+              </w:rPr>
+              <w:t>Δ=291 Hz</w:t>
+            </w:r>
+          </w:p>
+        </w:tc>
+        <w:tc>
+          <w:tcPr>
+            <w:tcW w:type="dxa" w:w="1417"/>
+          </w:tcPr>
+          <w:p>
+            <w:pPr>
+              <w:jc w:val="center"/>
+            </w:pPr>
+            <w:r/>
+            <w:r>
+              <w:rPr>
+                <w:b w:val="0"/>
+                <w:sz w:val="18"/>
+              </w:rPr>
+              <w:t>Complémentaire</w:t>
+            </w:r>
+          </w:p>
+        </w:tc>
+        <w:tc>
+          <w:tcPr>
+            <w:tcW w:type="dxa" w:w="1417"/>
+          </w:tcPr>
+          <w:p>
+            <w:pPr>
+              <w:jc w:val="center"/>
+            </w:pPr>
+            <w:r/>
+            <w:r>
+              <w:rPr>
+                <w:b w:val="0"/>
+                <w:sz w:val="18"/>
+              </w:rPr>
+              <w:t>Unisson</w:t>
+            </w:r>
+          </w:p>
+        </w:tc>
+      </w:tr>
+      <w:tr>
+        <w:tc>
+          <w:tcPr>
+            <w:tcW w:type="dxa" w:w="1814"/>
+          </w:tcPr>
+          <w:p>
+            <w:pPr>
+              <w:jc w:val="center"/>
+            </w:pPr>
+            <w:r/>
+            <w:r>
+              <w:rPr>
+                <w:b/>
+                <w:sz w:val="18"/>
+              </w:rPr>
               <w:t>Violon</w:t>
             </w:r>
           </w:p>
@@ -14760,7 +14870,7 @@
                 <w:b w:val="0"/>
                 <w:sz w:val="18"/>
               </w:rPr>
-              <w:t>1 034</w:t>
+              <w:t>506</w:t>
             </w:r>
           </w:p>
         </w:tc>
@@ -14778,7 +14888,7 @@
                 <w:b w:val="0"/>
                 <w:sz w:val="18"/>
               </w:rPr>
-              <w:t>Δ=291 Hz</w:t>
+              <w:t>Δ=237 Hz</w:t>
             </w:r>
           </w:p>
         </w:tc>
@@ -14878,7 +14988,7 @@
           <w:i/>
           <w:sz w:val="20"/>
         </w:rPr>
-        <w:t>Son plus sombre et mélancolique que le hautbois. F1=452 Hz tombe dans le cluster de convergence 450–502 Hz (zone /o/) — ce qui explique sa fusion naturelle avec le cor (457 Hz), le basson (502 Hz) et le violoncelle (499 Hz). Backus cite ~930 Hz mais correspond vraisemblablement au Fp ou F2. Fp=1 135 Hz.</w:t>
+        <w:t>Son plus sombre et mélancolique que le hautbois. F1=452 Hz tombe dans la zone /o/ — ce qui explique sa convergence naturelle avec le cor (F1=388 Hz, Δ=64 Hz), le basson (F1=495 Hz, Δ=43 Hz) et la clarinette Sib (F1=463 Hz, Δ=11 Hz). Backus cite ~930 Hz correspondant vraisemblablement au Fp ou F2. Fp=1 135 Hz.</w:t>
       </w:r>
     </w:p>
     <w:p>
@@ -16322,7 +16432,7 @@
                 <w:b/>
                 <w:sz w:val="18"/>
               </w:rPr>
-              <w:t>Clarinette Sib</w:t>
+              <w:t>Cor</w:t>
             </w:r>
           </w:p>
         </w:tc>
@@ -16358,7 +16468,7 @@
                 <w:b w:val="0"/>
                 <w:sz w:val="18"/>
               </w:rPr>
-              <w:t>1 016</w:t>
+              <w:t>388</w:t>
             </w:r>
           </w:p>
         </w:tc>
@@ -16376,7 +16486,7 @@
                 <w:b w:val="0"/>
                 <w:sz w:val="18"/>
               </w:rPr>
-              <w:t>Δ=564 Hz</w:t>
+              <w:t>Δ=64 Hz</w:t>
             </w:r>
           </w:p>
         </w:tc>
@@ -16394,7 +16504,7 @@
                 <w:b w:val="0"/>
                 <w:sz w:val="18"/>
               </w:rPr>
-              <w:t>Complémentaire</w:t>
+              <w:t>Excellente</w:t>
             </w:r>
           </w:p>
         </w:tc>
@@ -16432,7 +16542,7 @@
                 <w:b/>
                 <w:sz w:val="18"/>
               </w:rPr>
-              <w:t>Cor</w:t>
+              <w:t>Basson</w:t>
             </w:r>
           </w:p>
         </w:tc>
@@ -16468,7 +16578,7 @@
                 <w:b w:val="0"/>
                 <w:sz w:val="18"/>
               </w:rPr>
-              <w:t>457</w:t>
+              <w:t>495</w:t>
             </w:r>
           </w:p>
         </w:tc>
@@ -16486,7 +16596,7 @@
                 <w:b w:val="0"/>
                 <w:sz w:val="18"/>
               </w:rPr>
-              <w:t>Δ=5 Hz</w:t>
+              <w:t>Δ=43 Hz</w:t>
             </w:r>
           </w:p>
         </w:tc>
@@ -16504,7 +16614,7 @@
                 <w:b w:val="0"/>
                 <w:sz w:val="18"/>
               </w:rPr>
-              <w:t>Quasi-parfaite</w:t>
+              <w:t>Excellente</w:t>
             </w:r>
           </w:p>
         </w:tc>
@@ -16542,7 +16652,7 @@
                 <w:b/>
                 <w:sz w:val="18"/>
               </w:rPr>
-              <w:t>Basson</w:t>
+              <w:t>Violoncelle</w:t>
             </w:r>
           </w:p>
         </w:tc>
@@ -16578,7 +16688,7 @@
                 <w:b w:val="0"/>
                 <w:sz w:val="18"/>
               </w:rPr>
-              <w:t>502</w:t>
+              <w:t>205</w:t>
             </w:r>
           </w:p>
         </w:tc>
@@ -16596,7 +16706,7 @@
                 <w:b w:val="0"/>
                 <w:sz w:val="18"/>
               </w:rPr>
-              <w:t>Δ=50 Hz</w:t>
+              <w:t>Δ=247 Hz</w:t>
             </w:r>
           </w:p>
         </w:tc>
@@ -16614,7 +16724,7 @@
                 <w:b w:val="0"/>
                 <w:sz w:val="18"/>
               </w:rPr>
-              <w:t>Excellente</w:t>
+              <w:t>Complémentaire</w:t>
             </w:r>
           </w:p>
         </w:tc>
@@ -16632,7 +16742,7 @@
                 <w:b w:val="0"/>
                 <w:sz w:val="18"/>
               </w:rPr>
-              <w:t>Unisson</w:t>
+              <w:t>Octave</w:t>
             </w:r>
           </w:p>
         </w:tc>
@@ -16652,7 +16762,7 @@
                 <w:b/>
                 <w:sz w:val="18"/>
               </w:rPr>
-              <w:t>Violoncelle</w:t>
+              <w:t>Clarinette Sib</w:t>
             </w:r>
           </w:p>
         </w:tc>
@@ -16688,7 +16798,7 @@
                 <w:b w:val="0"/>
                 <w:sz w:val="18"/>
               </w:rPr>
-              <w:t>499</w:t>
+              <w:t>463</w:t>
             </w:r>
           </w:p>
         </w:tc>
@@ -16706,7 +16816,7 @@
                 <w:b w:val="0"/>
                 <w:sz w:val="18"/>
               </w:rPr>
-              <w:t>Δ=47 Hz</w:t>
+              <w:t>Δ=11 Hz</w:t>
             </w:r>
           </w:p>
         </w:tc>
@@ -16724,7 +16834,7 @@
                 <w:b w:val="0"/>
                 <w:sz w:val="18"/>
               </w:rPr>
-              <w:t>Excellente</w:t>
+              <w:t>Quasi-parfaite</w:t>
             </w:r>
           </w:p>
         </w:tc>
@@ -16806,7 +16916,7 @@
           <w:i/>
           <w:sz w:val="20"/>
         </w:rPr>
-        <w:t>Découverte clé : correction majeure — ancien F1=317 Hz (erreur de pipeline) corrigé en 502 Hz. Accord unanime des 4 sources : Giesler (500) = Backus (440–500) = Meyer (~500) = SOL2020 (502 Hz). Le basson est le pivot timbral de l'orchestre (Meyer) avec Δ=3 Hz avec le violoncelle — la doublure la plus parfaite du corpus. F1=502 Hz au cœur du cluster de convergence /o/ (450–502 Hz).</w:t>
+        <w:t>Pivot timbral de l'orchestre (Meyer). F1=495 Hz au cœur de la zone /o/. Accord unanime des 4 sources : Giesler (500) = Backus (440–500) = Meyer (~500) = SOL2020 (495 Hz). Convergences clés : Δ=11 Hz avec le violon (F1=506 Hz), Δ=43 Hz avec le cor anglais (F1=452 Hz), Δ=107 Hz avec le cor (F1=388 Hz). Fp=1 079 Hz.</w:t>
       </w:r>
     </w:p>
     <w:p>
@@ -20594,7 +20704,7 @@
                 <w:b/>
                 <w:sz w:val="18"/>
               </w:rPr>
-              <w:t>Violoncelle</w:t>
+              <w:t>Violon</w:t>
             </w:r>
           </w:p>
         </w:tc>
@@ -20612,7 +20722,7 @@
                 <w:b w:val="0"/>
                 <w:sz w:val="18"/>
               </w:rPr>
-              <w:t>502</w:t>
+              <w:t>495</w:t>
             </w:r>
           </w:p>
         </w:tc>
@@ -20630,7 +20740,7 @@
                 <w:b w:val="0"/>
                 <w:sz w:val="18"/>
               </w:rPr>
-              <w:t>499</w:t>
+              <w:t>506</w:t>
             </w:r>
           </w:p>
         </w:tc>
@@ -20648,7 +20758,7 @@
                 <w:b w:val="0"/>
                 <w:sz w:val="18"/>
               </w:rPr>
-              <w:t>Δ=3 Hz</w:t>
+              <w:t>Δ=11 Hz</w:t>
             </w:r>
           </w:p>
         </w:tc>
@@ -20666,7 +20776,7 @@
                 <w:b w:val="0"/>
                 <w:sz w:val="18"/>
               </w:rPr>
-              <w:t>Quasi-parfaite ★</w:t>
+              <w:t>Quasi-parfaite</w:t>
             </w:r>
           </w:p>
         </w:tc>
@@ -20704,7 +20814,7 @@
                 <w:b/>
                 <w:sz w:val="18"/>
               </w:rPr>
-              <w:t>Cor</w:t>
+              <w:t>Cor anglais</w:t>
             </w:r>
           </w:p>
         </w:tc>
@@ -20722,7 +20832,7 @@
                 <w:b w:val="0"/>
                 <w:sz w:val="18"/>
               </w:rPr>
-              <w:t>502</w:t>
+              <w:t>495</w:t>
             </w:r>
           </w:p>
         </w:tc>
@@ -20740,7 +20850,7 @@
                 <w:b w:val="0"/>
                 <w:sz w:val="18"/>
               </w:rPr>
-              <w:t>457</w:t>
+              <w:t>452</w:t>
             </w:r>
           </w:p>
         </w:tc>
@@ -20758,7 +20868,7 @@
                 <w:b w:val="0"/>
                 <w:sz w:val="18"/>
               </w:rPr>
-              <w:t>Δ=45 Hz</w:t>
+              <w:t>Δ=43 Hz</w:t>
             </w:r>
           </w:p>
         </w:tc>
@@ -20814,7 +20924,7 @@
                 <w:b/>
                 <w:sz w:val="18"/>
               </w:rPr>
-              <w:t>Trombone</w:t>
+              <w:t>Cor</w:t>
             </w:r>
           </w:p>
         </w:tc>
@@ -20832,7 +20942,7 @@
                 <w:b w:val="0"/>
                 <w:sz w:val="18"/>
               </w:rPr>
-              <w:t>502</w:t>
+              <w:t>495</w:t>
             </w:r>
           </w:p>
         </w:tc>
@@ -20850,7 +20960,7 @@
                 <w:b w:val="0"/>
                 <w:sz w:val="18"/>
               </w:rPr>
-              <w:t>491</w:t>
+              <w:t>388</w:t>
             </w:r>
           </w:p>
         </w:tc>
@@ -20868,7 +20978,7 @@
                 <w:b w:val="0"/>
                 <w:sz w:val="18"/>
               </w:rPr>
-              <w:t>Δ=11 Hz</w:t>
+              <w:t>Δ=107 Hz</w:t>
             </w:r>
           </w:p>
         </w:tc>
@@ -20886,7 +20996,7 @@
                 <w:b w:val="0"/>
                 <w:sz w:val="18"/>
               </w:rPr>
-              <w:t>Quasi-parfaite</w:t>
+              <w:t>Bonne</w:t>
             </w:r>
           </w:p>
         </w:tc>
@@ -20924,7 +21034,7 @@
                 <w:b/>
                 <w:sz w:val="18"/>
               </w:rPr>
-              <w:t>Cor anglais</w:t>
+              <w:t>Trombone</w:t>
             </w:r>
           </w:p>
         </w:tc>
@@ -20942,7 +21052,7 @@
                 <w:b w:val="0"/>
                 <w:sz w:val="18"/>
               </w:rPr>
-              <w:t>502</w:t>
+              <w:t>495</w:t>
             </w:r>
           </w:p>
         </w:tc>
@@ -20960,7 +21070,7 @@
                 <w:b w:val="0"/>
                 <w:sz w:val="18"/>
               </w:rPr>
-              <w:t>452</w:t>
+              <w:t>237</w:t>
             </w:r>
           </w:p>
         </w:tc>
@@ -20978,7 +21088,7 @@
                 <w:b w:val="0"/>
                 <w:sz w:val="18"/>
               </w:rPr>
-              <w:t>Δ=50 Hz</w:t>
+              <w:t>Δ=258 Hz</w:t>
             </w:r>
           </w:p>
         </w:tc>
@@ -20996,7 +21106,7 @@
                 <w:b w:val="0"/>
                 <w:sz w:val="18"/>
               </w:rPr>
-              <w:t>Excellente</w:t>
+              <w:t>Complémentaire</w:t>
             </w:r>
           </w:p>
         </w:tc>
@@ -21015,116 +21125,6 @@
                 <w:sz w:val="18"/>
               </w:rPr>
               <w:t>Unisson</w:t>
-            </w:r>
-          </w:p>
-        </w:tc>
-      </w:tr>
-      <w:tr>
-        <w:tc>
-          <w:tcPr>
-            <w:tcW w:type="dxa" w:w="1814"/>
-          </w:tcPr>
-          <w:p>
-            <w:pPr>
-              <w:jc w:val="center"/>
-            </w:pPr>
-            <w:r/>
-            <w:r>
-              <w:rPr>
-                <w:b/>
-                <w:sz w:val="18"/>
-              </w:rPr>
-              <w:t>Trompette</w:t>
-            </w:r>
-          </w:p>
-        </w:tc>
-        <w:tc>
-          <w:tcPr>
-            <w:tcW w:type="dxa" w:w="907"/>
-          </w:tcPr>
-          <w:p>
-            <w:pPr>
-              <w:jc w:val="center"/>
-            </w:pPr>
-            <w:r/>
-            <w:r>
-              <w:rPr>
-                <w:b w:val="0"/>
-                <w:sz w:val="18"/>
-              </w:rPr>
-              <w:t>502</w:t>
-            </w:r>
-          </w:p>
-        </w:tc>
-        <w:tc>
-          <w:tcPr>
-            <w:tcW w:type="dxa" w:w="907"/>
-          </w:tcPr>
-          <w:p>
-            <w:pPr>
-              <w:jc w:val="center"/>
-            </w:pPr>
-            <w:r/>
-            <w:r>
-              <w:rPr>
-                <w:b w:val="0"/>
-                <w:sz w:val="18"/>
-              </w:rPr>
-              <w:t>457</w:t>
-            </w:r>
-          </w:p>
-        </w:tc>
-        <w:tc>
-          <w:tcPr>
-            <w:tcW w:type="dxa" w:w="1020"/>
-          </w:tcPr>
-          <w:p>
-            <w:pPr>
-              <w:jc w:val="center"/>
-            </w:pPr>
-            <w:r/>
-            <w:r>
-              <w:rPr>
-                <w:b w:val="0"/>
-                <w:sz w:val="18"/>
-              </w:rPr>
-              <w:t>Δ=45 Hz</w:t>
-            </w:r>
-          </w:p>
-        </w:tc>
-        <w:tc>
-          <w:tcPr>
-            <w:tcW w:type="dxa" w:w="1417"/>
-          </w:tcPr>
-          <w:p>
-            <w:pPr>
-              <w:jc w:val="center"/>
-            </w:pPr>
-            <w:r/>
-            <w:r>
-              <w:rPr>
-                <w:b w:val="0"/>
-                <w:sz w:val="18"/>
-              </w:rPr>
-              <w:t>Complémentaire</w:t>
-            </w:r>
-          </w:p>
-        </w:tc>
-        <w:tc>
-          <w:tcPr>
-            <w:tcW w:type="dxa" w:w="1417"/>
-          </w:tcPr>
-          <w:p>
-            <w:pPr>
-              <w:jc w:val="center"/>
-            </w:pPr>
-            <w:r/>
-            <w:r>
-              <w:rPr>
-                <w:b w:val="0"/>
-                <w:sz w:val="18"/>
-              </w:rPr>
-              <w:t>Octave</w:t>
             </w:r>
           </w:p>
         </w:tc>
@@ -21188,7 +21188,7 @@
           <w:i/>
           <w:sz w:val="20"/>
         </w:rPr>
-        <w:t>Son très grave et bourdonnant, fondation des bois graves. F1=226 Hz (zone /u/), identique au tuba basse. Fp=1 279 Hz. Technique analysée : non-vibrato uniquement (pas d'ordinario dans la base SOL2020/Yan_Adds). Son rôle harmonique est identique au tuba contrebasse.</w:t>
+        <w:t>Son très grave et bourdonnant, fondation des bois graves. F1=226 Hz (zone /u/), identique au tuba basse et tuba contrebasse — unisson formantique parfait entre ces trois instruments de différentes familles. Fp=1 279 Hz. Technique analysée : non-vibrato uniquement (pas d'ordinario dans la base SOL2020/Yan_Adds).</w:t>
       </w:r>
     </w:p>
     <w:p>
@@ -22094,7 +22094,7 @@
                 <w:b w:val="0"/>
                 <w:sz w:val="18"/>
               </w:rPr>
-              <w:t>249</w:t>
+              <w:t>226</w:t>
             </w:r>
           </w:p>
         </w:tc>
@@ -22112,7 +22112,7 @@
                 <w:b w:val="0"/>
                 <w:sz w:val="18"/>
               </w:rPr>
-              <w:t>Δ=23 Hz</w:t>
+              <w:t>Δ=0 Hz</w:t>
             </w:r>
           </w:p>
         </w:tc>
@@ -22130,7 +22130,7 @@
                 <w:b w:val="0"/>
                 <w:sz w:val="18"/>
               </w:rPr>
-              <w:t>Excellente</w:t>
+              <w:t>Quasi-parfaite ★</w:t>
             </w:r>
           </w:p>
         </w:tc>
@@ -22168,7 +22168,7 @@
                 <w:b/>
                 <w:sz w:val="18"/>
               </w:rPr>
-              <w:t>Contrebasse</w:t>
+              <w:t>Tuba contrebasse</w:t>
             </w:r>
           </w:p>
         </w:tc>
@@ -22204,7 +22204,7 @@
                 <w:b w:val="0"/>
                 <w:sz w:val="18"/>
               </w:rPr>
-              <w:t>200</w:t>
+              <w:t>226</w:t>
             </w:r>
           </w:p>
         </w:tc>
@@ -22222,7 +22222,7 @@
                 <w:b w:val="0"/>
                 <w:sz w:val="18"/>
               </w:rPr>
-              <w:t>Δ=26 Hz</w:t>
+              <w:t>Δ=0 Hz</w:t>
             </w:r>
           </w:p>
         </w:tc>
@@ -22240,7 +22240,7 @@
                 <w:b w:val="0"/>
                 <w:sz w:val="18"/>
               </w:rPr>
-              <w:t>Excellente</w:t>
+              <w:t>Quasi-parfaite ★</w:t>
             </w:r>
           </w:p>
         </w:tc>
@@ -22258,7 +22258,7 @@
                 <w:b w:val="0"/>
                 <w:sz w:val="18"/>
               </w:rPr>
-              <w:t>Unisson</w:t>
+              <w:t>Octave</w:t>
             </w:r>
           </w:p>
         </w:tc>
@@ -22278,7 +22278,7 @@
                 <w:b/>
                 <w:sz w:val="18"/>
               </w:rPr>
-              <w:t>Tuba contrebasse</w:t>
+              <w:t>Contrebasse</w:t>
             </w:r>
           </w:p>
         </w:tc>
@@ -22314,7 +22314,7 @@
                 <w:b w:val="0"/>
                 <w:sz w:val="18"/>
               </w:rPr>
-              <w:t>471</w:t>
+              <w:t>172</w:t>
             </w:r>
           </w:p>
         </w:tc>
@@ -22332,7 +22332,7 @@
                 <w:b w:val="0"/>
                 <w:sz w:val="18"/>
               </w:rPr>
-              <w:t>Δ=245 Hz</w:t>
+              <w:t>Δ=54 Hz</w:t>
             </w:r>
           </w:p>
         </w:tc>
@@ -22350,7 +22350,7 @@
                 <w:b w:val="0"/>
                 <w:sz w:val="18"/>
               </w:rPr>
-              <w:t>Complémentaire</w:t>
+              <w:t>Excellente</w:t>
             </w:r>
           </w:p>
         </w:tc>
@@ -22368,7 +22368,7 @@
                 <w:b w:val="0"/>
                 <w:sz w:val="18"/>
               </w:rPr>
-              <w:t>Complémentaire</w:t>
+              <w:t>Unisson</w:t>
             </w:r>
           </w:p>
         </w:tc>
@@ -23641,7 +23641,7 @@
                 <w:b w:val="0"/>
                 <w:sz w:val="18"/>
               </w:rPr>
-              <w:t>2 336</w:t>
+              <w:t>1 109</w:t>
             </w:r>
           </w:p>
         </w:tc>
@@ -23659,7 +23659,7 @@
                 <w:b w:val="0"/>
                 <w:sz w:val="18"/>
               </w:rPr>
-              <w:t>1 658</w:t>
+              <w:t>Δ=431 Hz</w:t>
             </w:r>
           </w:p>
         </w:tc>
@@ -23751,7 +23751,7 @@
                 <w:b w:val="0"/>
                 <w:sz w:val="18"/>
               </w:rPr>
-              <w:t>1 034</w:t>
+              <w:t>506</w:t>
             </w:r>
           </w:p>
         </w:tc>
@@ -23769,7 +23769,7 @@
                 <w:b w:val="0"/>
                 <w:sz w:val="18"/>
               </w:rPr>
-              <w:t>Δ=356 Hz</w:t>
+              <w:t>Δ=172 Hz</w:t>
             </w:r>
           </w:p>
         </w:tc>
@@ -27545,7 +27545,7 @@
                 <w:b w:val="0"/>
                 <w:sz w:val="18"/>
               </w:rPr>
-              <w:t>1 016</w:t>
+              <w:t>463</w:t>
             </w:r>
           </w:p>
         </w:tc>
@@ -27563,7 +27563,7 @@
                 <w:b w:val="0"/>
                 <w:sz w:val="18"/>
               </w:rPr>
-              <w:t>1 045</w:t>
+              <w:t>452</w:t>
             </w:r>
           </w:p>
         </w:tc>
@@ -27581,7 +27581,7 @@
                 <w:b w:val="0"/>
                 <w:sz w:val="18"/>
               </w:rPr>
-              <w:t>Δ=29 Hz</w:t>
+              <w:t>Δ=11 Hz</w:t>
             </w:r>
           </w:p>
         </w:tc>
@@ -27599,7 +27599,7 @@
                 <w:b w:val="0"/>
                 <w:sz w:val="18"/>
               </w:rPr>
-              <w:t>Excellente</w:t>
+              <w:t>Quasi-parfaite</w:t>
             </w:r>
           </w:p>
         </w:tc>
@@ -27637,7 +27637,7 @@
                 <w:b/>
                 <w:sz w:val="18"/>
               </w:rPr>
-              <w:t>Hautbois</w:t>
+              <w:t>Alto</w:t>
             </w:r>
           </w:p>
         </w:tc>
@@ -27655,7 +27655,7 @@
                 <w:b w:val="0"/>
                 <w:sz w:val="18"/>
               </w:rPr>
-              <w:t>1 016</w:t>
+              <w:t>463</w:t>
             </w:r>
           </w:p>
         </w:tc>
@@ -27673,7 +27673,7 @@
                 <w:b w:val="0"/>
                 <w:sz w:val="18"/>
               </w:rPr>
-              <w:t>1 460</w:t>
+              <w:t>377</w:t>
             </w:r>
           </w:p>
         </w:tc>
@@ -27691,7 +27691,7 @@
                 <w:b w:val="0"/>
                 <w:sz w:val="18"/>
               </w:rPr>
-              <w:t>Δ=444 Hz</w:t>
+              <w:t>Δ=86 Hz</w:t>
             </w:r>
           </w:p>
         </w:tc>
@@ -27709,7 +27709,7 @@
                 <w:b w:val="0"/>
                 <w:sz w:val="18"/>
               </w:rPr>
-              <w:t>Complémentaire</w:t>
+              <w:t>Bonne</w:t>
             </w:r>
           </w:p>
         </w:tc>
@@ -27747,7 +27747,7 @@
                 <w:b/>
                 <w:sz w:val="18"/>
               </w:rPr>
-              <w:t>Alto</w:t>
+              <w:t>Hautbois</w:t>
             </w:r>
           </w:p>
         </w:tc>
@@ -27765,7 +27765,7 @@
                 <w:b w:val="0"/>
                 <w:sz w:val="18"/>
               </w:rPr>
-              <w:t>1 016</w:t>
+              <w:t>463</w:t>
             </w:r>
           </w:p>
         </w:tc>
@@ -27783,7 +27783,7 @@
                 <w:b w:val="0"/>
                 <w:sz w:val="18"/>
               </w:rPr>
-              <w:t>369</w:t>
+              <w:t>743</w:t>
             </w:r>
           </w:p>
         </w:tc>
@@ -27801,7 +27801,7 @@
                 <w:b w:val="0"/>
                 <w:sz w:val="18"/>
               </w:rPr>
-              <w:t>Δ=647 Hz</w:t>
+              <w:t>Δ=280 Hz</w:t>
             </w:r>
           </w:p>
         </w:tc>
@@ -29071,7 +29071,7 @@
                 <w:b w:val="0"/>
                 <w:sz w:val="18"/>
               </w:rPr>
-              <w:t>909</w:t>
+              <w:t>323</w:t>
             </w:r>
           </w:p>
         </w:tc>
@@ -29089,7 +29089,7 @@
                 <w:b w:val="0"/>
                 <w:sz w:val="18"/>
               </w:rPr>
-              <w:t>894</w:t>
+              <w:t>258</w:t>
             </w:r>
           </w:p>
         </w:tc>
@@ -29107,7 +29107,7 @@
                 <w:b w:val="0"/>
                 <w:sz w:val="18"/>
               </w:rPr>
-              <w:t>Δ=15 Hz</w:t>
+              <w:t>Δ=65 Hz</w:t>
             </w:r>
           </w:p>
         </w:tc>
@@ -29125,7 +29125,7 @@
                 <w:b w:val="0"/>
                 <w:sz w:val="18"/>
               </w:rPr>
-              <w:t>Quasi-parfaite</w:t>
+              <w:t>Excellente</w:t>
             </w:r>
           </w:p>
         </w:tc>
@@ -29181,7 +29181,7 @@
                 <w:b w:val="0"/>
                 <w:sz w:val="18"/>
               </w:rPr>
-              <w:t>909</w:t>
+              <w:t>323</w:t>
             </w:r>
           </w:p>
         </w:tc>
@@ -29199,7 +29199,7 @@
                 <w:b w:val="0"/>
                 <w:sz w:val="18"/>
               </w:rPr>
-              <w:t>1 016</w:t>
+              <w:t>463</w:t>
             </w:r>
           </w:p>
         </w:tc>
@@ -29217,7 +29217,7 @@
                 <w:b w:val="0"/>
                 <w:sz w:val="18"/>
               </w:rPr>
-              <w:t>Δ=107 Hz</w:t>
+              <w:t>Δ=140 Hz</w:t>
             </w:r>
           </w:p>
         </w:tc>
@@ -29273,7 +29273,7 @@
                 <w:b/>
                 <w:sz w:val="18"/>
               </w:rPr>
-              <w:t>Basson</w:t>
+              <w:t>Contrebasson</w:t>
             </w:r>
           </w:p>
         </w:tc>
@@ -29291,7 +29291,7 @@
                 <w:b w:val="0"/>
                 <w:sz w:val="18"/>
               </w:rPr>
-              <w:t>909</w:t>
+              <w:t>323</w:t>
             </w:r>
           </w:p>
         </w:tc>
@@ -29309,7 +29309,7 @@
                 <w:b w:val="0"/>
                 <w:sz w:val="18"/>
               </w:rPr>
-              <w:t>502</w:t>
+              <w:t>226</w:t>
             </w:r>
           </w:p>
         </w:tc>
@@ -29327,7 +29327,7 @@
                 <w:b w:val="0"/>
                 <w:sz w:val="18"/>
               </w:rPr>
-              <w:t>Δ=407 Hz</w:t>
+              <w:t>Δ=97 Hz</w:t>
             </w:r>
           </w:p>
         </w:tc>
@@ -29345,7 +29345,7 @@
                 <w:b w:val="0"/>
                 <w:sz w:val="18"/>
               </w:rPr>
-              <w:t>Complémentaire</w:t>
+              <w:t>Bonne</w:t>
             </w:r>
           </w:p>
         </w:tc>
@@ -29427,7 +29427,7 @@
           <w:i/>
           <w:sz w:val="20"/>
         </w:rPr>
-        <w:t>Son extrêmement grave, puissant et bourdonnant. F1=323 Hz identique à la clarinette basse, mais F2=937 Hz montre une résonance plus développée dans le medium. Timbre massif et enveloppant. Instrument rare.</w:t>
+        <w:t>Son extrêmement grave, puissant et bourdonnant. F1=323 Hz identique à la clarinette basse, mais F2=947 Hz montre une résonance plus développée dans le medium. Timbre massif et enveloppant. Instrument rare.</w:t>
       </w:r>
     </w:p>
     <w:p>
@@ -30579,7 +30579,7 @@
                 <w:b w:val="0"/>
                 <w:sz w:val="18"/>
               </w:rPr>
-              <w:t>249</w:t>
+              <w:t>226</w:t>
             </w:r>
           </w:p>
         </w:tc>
@@ -30597,7 +30597,7 @@
                 <w:b w:val="0"/>
                 <w:sz w:val="18"/>
               </w:rPr>
-              <w:t>Δ=74 Hz</w:t>
+              <w:t>Δ=97 Hz</w:t>
             </w:r>
           </w:p>
         </w:tc>

</xml_diff>